<commit_message>
fix(psychopathologie): leçons 13, 15 et 16 — le PDF de chaque recommandation HAS/ANESM lu et lié à côté de sa notice (Alzheimer 2009, souffrance psychique 2014 + chapitre 4, handicap psychique 2016, TDI volet 2) ; aucune formulation ne change, journaux datés
Co-Authored-By: Claude Opus 5 <noreply@anthropic.com>
</commit_message>
<xml_diff>
--- a/livrables/lecons/2026-08-31_lecon-psychopathologie_13_troubles-neurocognitifs-vieillissement.docx
+++ b/livrables/lecons/2026-08-31_lecon-psychopathologie_13_troubles-neurocognitifs-vieillissement.docx
@@ -3810,6 +3810,48 @@
         </w:numPr>
         <w:spacing w:after="40" w:before="40"/>
       </w:pPr>
+      <w:r>
+        <w:rPr>
+          <w:rFonts w:ascii="Times New Roman" w:cs="Times New Roman" w:eastAsia="Times New Roman" w:hAnsi="Times New Roman"/>
+          <w:color w:val="1F2937"/>
+          <w:sz w:val="22"/>
+          <w:szCs w:val="22"/>
+        </w:rPr>
+        <w:t xml:space="preserve"/>
+      </w:r>
+      <w:hyperlink w:history="1" r:id="rIdPdfAlz2009">
+        <w:r>
+          <w:rPr>
+            <w:rFonts w:ascii="Times New Roman" w:cs="Times New Roman" w:eastAsia="Times New Roman" w:hAnsi="Times New Roman"/>
+            <w:color w:val="1155CC"/>
+            <w:sz w:val="22"/>
+            <w:szCs w:val="22"/>
+            <w:u w:val="single"/>
+          </w:rPr>
+          <w:t xml:space="preserve">Le document : RBPP « L'accompagnement des personnes atteintes d'une maladie d'Alzheimer ou apparentée en établissement médico-social » — PDF, 47 pages, Anesm, Février 2009</w:t>
+        </w:r>
+      </w:hyperlink>
+      <w:r>
+        <w:rPr>
+          <w:rFonts w:ascii="Times New Roman" w:cs="Times New Roman" w:eastAsia="Times New Roman" w:hAnsi="Times New Roman"/>
+          <w:i/>
+          <w:iCs/>
+          <w:color w:val="6B7280"/>
+          <w:sz w:val="20"/>
+          <w:szCs w:val="20"/>
+        </w:rPr>
+        <w:t xml:space="preserve"> [Corrigé le 21/09/2026 : la ligne précédente est la notice HAS ; le document, lu ce jour, confirme le plan Alzheimer 2008-2012 et écrit que l'accompagnement a pour but « de préserver, maintenir et/ou restaurer l'autonomie de la personne, dans les choix et actes de la vie quotidienne comme dans les décisions importantes à prendre ».]</w:t>
+      </w:r>
+    </w:p>
+    <w:p>
+      <w:pPr>
+        <w:pStyle w:val="ListParagraph"/>
+        <w:numPr>
+          <w:ilvl w:val="0"/>
+          <w:numId w:val="1"/>
+        </w:numPr>
+        <w:spacing w:after="40" w:before="40"/>
+      </w:pPr>
       <w:hyperlink w:history="1" r:id="rIdbkgon66c2l7nzaqs36yvl">
         <w:r>
           <w:rPr>
@@ -4207,6 +4249,60 @@
           <w:szCs w:val="22"/>
         </w:rPr>
         <w:t xml:space="preserve">Vérifié lors de la relecture et inchangé : les trois catégories du DSM-5 et le remplacement de « démence » par « trouble neurocognitif » ; les six domaines cognitifs et leurs observables ; les cinq sous-types étiologiques et leurs marqueurs distinctifs ; le tableau de distinction délirium / TNC majeur ; la catégorie F06.7 de la CIM-10 et la convergence de la CIM-11 vers le DSM-5 ; le vieillissement précoce documenté dans la trisomie 21 ; les trois stades de l'exercice 3 ; et les trois URL HAS des ressources, testées ce jour (statut 200). Le point déontologique de la partie B du challenge — évaluer le déclin par rapport au fonctionnement ANTÉRIEUR de la personne et non à une norme populationnelle — est le passage le plus important de la leçon et n'a pas été touché.</w:t>
+      </w:r>
+    </w:p>
+    <w:p>
+      <w:pPr>
+        <w:pStyle w:val="Heading2"/>
+        <w:spacing w:after="100" w:before="280"/>
+      </w:pPr>
+      <w:r>
+        <w:rPr>
+          <w:rFonts w:ascii="Times New Roman" w:cs="Times New Roman" w:eastAsia="Times New Roman" w:hAnsi="Times New Roman"/>
+          <w:b/>
+          <w:bCs/>
+          <w:color w:val="1B3A6B"/>
+          <w:sz w:val="28"/>
+          <w:szCs w:val="28"/>
+        </w:rPr>
+        <w:t xml:space="preserve">📝 Journal des corrections — 21 septembre 2026</w:t>
+      </w:r>
+    </w:p>
+    <w:p>
+      <w:pPr>
+        <w:spacing w:after="60" w:before="60"/>
+      </w:pPr>
+      <w:r>
+        <w:rPr>
+          <w:rFonts w:ascii="Times New Roman" w:cs="Times New Roman" w:eastAsia="Times New Roman" w:hAnsi="Times New Roman"/>
+          <w:i/>
+          <w:iCs/>
+          <w:color w:val="6B7280"/>
+          <w:sz w:val="20"/>
+          <w:szCs w:val="20"/>
+        </w:rPr>
+        <w:t xml:space="preserve">Relecture du 21/09/2026 : le PDF de la recommandation (47 pages, Février 2009) est lu et lié à côté de la notice HAS. Ce que la leçon en disait — plan Alzheimer 2008-2012, autonomie dans les choix de vie quotidienne, projet personnalisé, formation des équipes — est dans le document. Aucune formulation ne change.</w:t>
+      </w:r>
+    </w:p>
+    <w:p>
+      <w:pPr>
+        <w:pStyle w:val="ListParagraph"/>
+        <w:numPr>
+          <w:ilvl w:val="0"/>
+          <w:numId w:val="1"/>
+        </w:numPr>
+        <w:spacing w:after="40" w:before="40"/>
+      </w:pPr>
+      <w:r>
+        <w:rPr>
+          <w:rFonts w:ascii="Times New Roman" w:cs="Times New Roman" w:eastAsia="Times New Roman" w:hAnsi="Times New Roman"/>
+          <w:i/>
+          <w:iCs/>
+          <w:color w:val="6B7280"/>
+          <w:sz w:val="20"/>
+          <w:szCs w:val="20"/>
+        </w:rPr>
+        <w:t xml:space="preserve">Ressources : seule la notice HAS de la recommandation était liée ; le document lui-même (PDF) ne l'était pas et n'avait pas été lu.</w:t>
       </w:r>
     </w:p>
     <w:sectPr>

</xml_diff>